<commit_message>
codex: export a ready-made Constant lifecycle profile
Add a Constant worksheet and matching named range at 100 for every vehicle age so Mileage and Fuel Economy can use it in LEAP. Update the modeller and Word guides to describe the simplified workflow.\n\nVerified: python -m pytest codebase/tests/test_lifecycle_profile_exporter.py -q (4 passed); generated and inspected the 01_AUS workbook; rendered and reviewed all 21 Word guide pages.
</commit_message>
<xml_diff>
--- a/docs/docx/Transport guide for LEAP.docx
+++ b/docs/docx/Transport guide for LEAP.docx
@@ -2348,7 +2348,7 @@
       <w:proofErr w:type="spellStart"/>
       <w:proofErr w:type="spellEnd"/>
       <w:r>
-        <w:t>The workbook contains two profile types:</w:t>
+        <w:t>The workbook contains three profile types:</w:t>
       </w:r>
     </w:p>
     <w:p>
@@ -2365,6 +2365,14 @@
       </w:pPr>
       <w:r>
         <w:t>Vintage profile: the distribution of vehicle ages in the base-year fleet.</w:t>
+      </w:r>
+    </w:p>
+    <w:p>
+      <w:pPr>
+        <w:pStyle w:val="ListBullet"/>
+      </w:pPr>
+      <w:r>
+        <w:t>Constant degradation curve: 100 at every vehicle age for Mileage and Fuel Economy.</w:t>
       </w:r>
     </w:p>
     <w:p>
@@ -2397,7 +2405,7 @@
       <w:r>
         <w:t>2.</w:t>
         <w:tab/>
-        <w:t>Keep the workbook open. The web app has already created the named ranges, and every range has the same name as its profile sheet.</w:t>
+        <w:t>Keep the workbook open. The web app has already created every profile sheet and matching named range, including Constant with a value of 100 at every vehicle age/year.</w:t>
       </w:r>
     </w:p>
     <w:p>
@@ -2437,7 +2445,7 @@
       <w:r>
         <w:t>6.</w:t>
         <w:tab/>
-        <w:t>Repeat for the remaining profile sheets.</w:t>
+        <w:t>Repeat for the remaining profile sheets, including Constant. No Excel range setup or Constant value entry is required.</w:t>
       </w:r>
     </w:p>
     <w:p>
@@ -2498,7 +2506,7 @@
           <w:color w:val="595959"/>
           <w:sz w:val="16"/>
         </w:rPr>
-        <w:t>Step 1: Open the downloaded workbook and keep it open. The web app has already created a matching named range for each profile sheet.</w:t>
+        <w:t>Step 1: Open the downloaded workbook and keep it open. The web app has already created every profile sheet and matching named range, including Constant at 100 for every vehicle age/year.</w:t>
       </w:r>
     </w:p>
     <w:p>
@@ -2616,16 +2624,10 @@
       </w:r>
     </w:p>
     <w:p>
-      <w:r>
-        <w:t xml:space="preserve">Lifecycle profile settings are made in Current Accounts. They are not </w:t>
-      </w:r>
       <w:proofErr w:type="gramStart"/>
-      <w:r>
-        <w:t>scenario-specific</w:t>
-      </w:r>
       <w:proofErr w:type="gramEnd"/>
       <w:r>
-        <w:t>. This means there is no separate Reference or Target lifecycle profile unless the model structure is deliberately changed.</w:t>
+        <w:t>Lifecycle profile settings are made in Current Accounts and are not scenario-specific.</w:t>
       </w:r>
     </w:p>
     <w:p>
@@ -2636,21 +2638,15 @@
           <w:numId w:val="0"/>
         </w:numPr>
       </w:pPr>
-      <w:r>
-        <w:t xml:space="preserve">When setting them use ctrl-D to copy the setting from a cell above. This will make </w:t>
-      </w:r>
       <w:proofErr w:type="gramStart"/>
-      <w:r>
-        <w:t>it</w:t>
-      </w:r>
       <w:proofErr w:type="gramEnd"/>
       <w:r>
-        <w:t xml:space="preserve"> so you don’t need to set everything in each branch for every fuel/technology.</w:t>
-      </w:r>
-    </w:p>
-    <w:p>
-      <w:r>
-        <w:t>Set the relevant lifecycle profiles for:</w:t>
+        <w:t>Use Ctrl+D to copy a setting from the cell above when the same profile applies to several branches.</w:t>
+      </w:r>
+    </w:p>
+    <w:p>
+      <w:r>
+        <w:t>Assign only these lifecycle profile settings:</w:t>
       </w:r>
     </w:p>
     <w:p>
@@ -2658,7 +2654,7 @@
         <w:pStyle w:val="ListBullet"/>
       </w:pPr>
       <w:r>
-        <w:t>Stock Vintage Profile;</w:t>
+        <w:t>Stock Share: set Stock Vintage Profile to the matching freight or passenger vintage profile.</w:t>
       </w:r>
     </w:p>
     <w:p>
@@ -2666,7 +2662,7 @@
         <w:pStyle w:val="ListBullet"/>
       </w:pPr>
       <w:r>
-        <w:t>Sales and Sales Share settings where LEAP requires lifecycle profile links; and</w:t>
+        <w:t>Sales Share: set Survival Profile to the matching freight or passenger survival profile.</w:t>
       </w:r>
     </w:p>
     <w:p>
@@ -2674,10 +2670,15 @@
         <w:pStyle w:val="ListBullet"/>
       </w:pPr>
       <w:r>
-        <w:t>Mileage and fuel economy settings where profile-related variables are exposed.</w:t>
-      </w:r>
-      <w:r>
-        <w:t xml:space="preserve"> </w:t>
+        <w:t>Mileage and Fuel Economy: set Degradation Profile to Constant. The downloaded lifecycle workbook already includes the Constant sheet and named range, with 100 at every vehicle age/year.</w:t>
+      </w:r>
+    </w:p>
+    <w:p>
+      <w:pPr>
+        <w:pStyle w:val="ListBullet"/>
+      </w:pPr>
+      <w:r>
+        <w:t>The Sales variable no longer needs a lifecycle profile.</w:t>
       </w:r>
     </w:p>
     <w:p>
@@ -2689,58 +2690,34 @@
         </w:tabs>
         <w:ind w:left="720"/>
       </w:pPr>
-      <w:r>
-        <w:t>We haven’t built methods to creat</w:t>
-      </w:r>
-      <w:r>
-        <w:t>e</w:t>
-      </w:r>
-      <w:r>
-        <w:t xml:space="preserve"> profiles for these variables but </w:t>
-      </w:r>
-      <w:r>
-        <w:t xml:space="preserve">the ‘LEAP Transport </w:t>
-      </w:r>
       <w:proofErr w:type="gramStart"/>
-      <w:r>
-        <w:t>exercise’</w:t>
-      </w:r>
       <w:proofErr w:type="gramEnd"/>
       <w:r>
-        <w:t xml:space="preserve"> example area contains an example of what could be used. This is somewhere we could improve the transport model as it is.</w:t>
-      </w:r>
-    </w:p>
-    <w:p>
-      <w:pPr>
-        <w:pStyle w:val="ListBullet"/>
-        <w:numPr>
-          <w:ilvl w:val="0"/>
-          <w:numId w:val="0"/>
-        </w:numPr>
-        <w:ind w:left="360" w:hanging="360"/>
-      </w:pPr>
-      <w:r>
-        <w:rPr>
-          <w:noProof/>
-        </w:rPr>
-        <w:lastRenderedPageBreak/>
+        <w:t>Use the Freight profiles for freight branches and the Passenger profiles for passenger branches.</w:t>
+      </w:r>
+    </w:p>
+    <w:p>
+      <w:pPr>
+        <w:keepNext/>
+        <w:jc w:val="center"/>
+      </w:pPr>
+      <w:r>
         <w:drawing>
-          <wp:inline distT="0" distB="0" distL="0" distR="0" wp14:anchorId="4FE13EB7" wp14:editId="7088540B">
-            <wp:extent cx="6400800" cy="3382010"/>
-            <wp:effectExtent l="0" t="0" r="0" b="8890"/>
-            <wp:docPr id="375950728" name="Picture 1"/>
+          <wp:inline xmlns:a="http://schemas.openxmlformats.org/drawingml/2006/main" xmlns:pic="http://schemas.openxmlformats.org/drawingml/2006/picture">
+            <wp:extent cx="5669280" cy="1628965"/>
+            <wp:docPr id="1521496000" name="Picture 1521496000"/>
             <wp:cNvGraphicFramePr>
-              <a:graphicFrameLocks xmlns:a="http://schemas.openxmlformats.org/drawingml/2006/main" noChangeAspect="1"/>
+              <a:graphicFrameLocks noChangeAspect="1"/>
             </wp:cNvGraphicFramePr>
-            <a:graphic xmlns:a="http://schemas.openxmlformats.org/drawingml/2006/main">
+            <a:graphic>
               <a:graphicData uri="http://schemas.openxmlformats.org/drawingml/2006/picture">
-                <pic:pic xmlns:pic="http://schemas.openxmlformats.org/drawingml/2006/picture">
+                <pic:pic>
                   <pic:nvPicPr>
-                    <pic:cNvPr id="375950728" name=""/>
+                    <pic:cNvPr id="0" name="setting profiles in variables 1.png"/>
                     <pic:cNvPicPr/>
                   </pic:nvPicPr>
                   <pic:blipFill>
-                    <a:blip r:embed="rId19"/>
+                    <a:blip r:embed="rId42"/>
                     <a:stretch>
                       <a:fillRect/>
                     </a:stretch>
@@ -2748,11 +2725,9 @@
                   <pic:spPr>
                     <a:xfrm>
                       <a:off x="0" y="0"/>
-                      <a:ext cx="6400800" cy="3382010"/>
+                      <a:ext cx="5669280" cy="1628965"/>
                     </a:xfrm>
-                    <a:prstGeom prst="rect">
-                      <a:avLst/>
-                    </a:prstGeom>
+                    <a:prstGeom prst="rect"/>
                   </pic:spPr>
                 </pic:pic>
               </a:graphicData>
@@ -2764,51 +2739,38 @@
     <w:p>
       <w:pPr>
         <w:jc w:val="center"/>
+      </w:pPr>
+      <w:r>
         <w:rPr>
           <w:i/>
           <w:color w:val="595959"/>
           <w:sz w:val="16"/>
         </w:rPr>
-      </w:pPr>
-      <w:r>
-        <w:rPr>
-          <w:i/>
-          <w:color w:val="595959"/>
-          <w:sz w:val="16"/>
-        </w:rPr>
-        <w:t>LEAP Transport exercise examples of the Vehicle distance profile for adjusting mileage as vehicles get older.</w:t>
-      </w:r>
-    </w:p>
-    <w:p>
-      <w:pPr>
-        <w:pStyle w:val="ListBullet"/>
-        <w:numPr>
-          <w:ilvl w:val="0"/>
-          <w:numId w:val="0"/>
-        </w:numPr>
-        <w:ind w:left="360" w:hanging="360"/>
-      </w:pPr>
-      <w:r>
-        <w:rPr>
-          <w:noProof/>
-        </w:rPr>
+        <w:t>In Stock Share, set Stock Vintage Profile to the matching freight or passenger vintage profile.</w:t>
+      </w:r>
+    </w:p>
+    <w:p>
+      <w:pPr>
+        <w:keepNext/>
+        <w:jc w:val="center"/>
+      </w:pPr>
+      <w:r>
         <w:drawing>
-          <wp:inline distT="0" distB="0" distL="0" distR="0" wp14:anchorId="3C4E97C2" wp14:editId="33404835">
-            <wp:extent cx="6400800" cy="3415665"/>
-            <wp:effectExtent l="0" t="0" r="8255" b="0"/>
-            <wp:docPr id="1521495996" name="Picture 1"/>
+          <wp:inline xmlns:a="http://schemas.openxmlformats.org/drawingml/2006/main" xmlns:pic="http://schemas.openxmlformats.org/drawingml/2006/picture">
+            <wp:extent cx="5669280" cy="1468914"/>
+            <wp:docPr id="1521496001" name="Picture 1521496001"/>
             <wp:cNvGraphicFramePr>
-              <a:graphicFrameLocks xmlns:a="http://schemas.openxmlformats.org/drawingml/2006/main" noChangeAspect="1"/>
+              <a:graphicFrameLocks noChangeAspect="1"/>
             </wp:cNvGraphicFramePr>
-            <a:graphic xmlns:a="http://schemas.openxmlformats.org/drawingml/2006/main">
+            <a:graphic>
               <a:graphicData uri="http://schemas.openxmlformats.org/drawingml/2006/picture">
-                <pic:pic xmlns:pic="http://schemas.openxmlformats.org/drawingml/2006/picture">
+                <pic:pic>
                   <pic:nvPicPr>
-                    <pic:cNvPr id="1521495996" name=""/>
+                    <pic:cNvPr id="0" name="setting profiles in variables 2.png"/>
                     <pic:cNvPicPr/>
                   </pic:nvPicPr>
                   <pic:blipFill>
-                    <a:blip r:embed="rId20"/>
+                    <a:blip r:embed="rId43"/>
                     <a:stretch>
                       <a:fillRect/>
                     </a:stretch>
@@ -2816,11 +2778,9 @@
                   <pic:spPr>
                     <a:xfrm>
                       <a:off x="0" y="0"/>
-                      <a:ext cx="6400800" cy="3415665"/>
+                      <a:ext cx="5669280" cy="1468914"/>
                     </a:xfrm>
-                    <a:prstGeom prst="rect">
-                      <a:avLst/>
-                    </a:prstGeom>
+                    <a:prstGeom prst="rect"/>
                   </pic:spPr>
                 </pic:pic>
               </a:graphicData>
@@ -2832,63 +2792,38 @@
     <w:p>
       <w:pPr>
         <w:jc w:val="center"/>
+      </w:pPr>
+      <w:r>
         <w:rPr>
           <w:i/>
           <w:color w:val="595959"/>
           <w:sz w:val="16"/>
         </w:rPr>
-      </w:pPr>
-      <w:r>
-        <w:rPr>
-          <w:i/>
-          <w:color w:val="595959"/>
-          <w:sz w:val="16"/>
-        </w:rPr>
-        <w:t>LEAP Transport exercise example</w:t>
-      </w:r>
-      <w:r>
-        <w:rPr>
-          <w:i/>
-          <w:color w:val="595959"/>
-          <w:sz w:val="16"/>
-        </w:rPr>
-        <w:t>s</w:t>
-      </w:r>
-      <w:r>
-        <w:rPr>
-          <w:i/>
-          <w:color w:val="595959"/>
-          <w:sz w:val="16"/>
-        </w:rPr>
-        <w:t xml:space="preserve"> of the Vehicle distance profile for adjusting mileage as vehicles get older.</w:t>
-      </w:r>
-    </w:p>
-    <w:p>
-      <w:pPr>
+        <w:t>For freight branches, set the Sales Share Survival Profile to Freight_vehicle_survival.</w:t>
+      </w:r>
+    </w:p>
+    <w:p>
+      <w:pPr>
+        <w:keepNext/>
         <w:jc w:val="center"/>
       </w:pPr>
       <w:r>
-        <w:rPr>
-          <w:noProof/>
-        </w:rPr>
-        <w:lastRenderedPageBreak/>
         <w:drawing>
-          <wp:inline distT="0" distB="0" distL="0" distR="0" wp14:anchorId="0DD03E20" wp14:editId="08EC0721">
-            <wp:extent cx="5669280" cy="3280962"/>
-            <wp:effectExtent l="0" t="0" r="0" b="0"/>
-            <wp:docPr id="8" name="Picture 8"/>
+          <wp:inline xmlns:a="http://schemas.openxmlformats.org/drawingml/2006/main" xmlns:pic="http://schemas.openxmlformats.org/drawingml/2006/picture">
+            <wp:extent cx="5669280" cy="2317630"/>
+            <wp:docPr id="1521496002" name="Picture 1521496002"/>
             <wp:cNvGraphicFramePr>
-              <a:graphicFrameLocks xmlns:a="http://schemas.openxmlformats.org/drawingml/2006/main" noChangeAspect="1"/>
+              <a:graphicFrameLocks noChangeAspect="1"/>
             </wp:cNvGraphicFramePr>
-            <a:graphic xmlns:a="http://schemas.openxmlformats.org/drawingml/2006/main">
+            <a:graphic>
               <a:graphicData uri="http://schemas.openxmlformats.org/drawingml/2006/picture">
-                <pic:pic xmlns:pic="http://schemas.openxmlformats.org/drawingml/2006/picture">
+                <pic:pic>
                   <pic:nvPicPr>
-                    <pic:cNvPr id="0" name="08_p023_rId13_1.png"/>
+                    <pic:cNvPr id="0" name="setting profiles in variables 3.png"/>
                     <pic:cNvPicPr/>
                   </pic:nvPicPr>
                   <pic:blipFill>
-                    <a:blip r:embed="rId21"/>
+                    <a:blip r:embed="rId44"/>
                     <a:stretch>
                       <a:fillRect/>
                     </a:stretch>
@@ -2896,11 +2831,9 @@
                   <pic:spPr>
                     <a:xfrm>
                       <a:off x="0" y="0"/>
-                      <a:ext cx="5669280" cy="3280962"/>
+                      <a:ext cx="5669280" cy="2317630"/>
                     </a:xfrm>
-                    <a:prstGeom prst="rect">
-                      <a:avLst/>
-                    </a:prstGeom>
+                    <a:prstGeom prst="rect"/>
                   </pic:spPr>
                 </pic:pic>
               </a:graphicData>
@@ -2919,299 +2852,7 @@
           <w:color w:val="595959"/>
           <w:sz w:val="16"/>
         </w:rPr>
-        <w:t>Original guide screenshot 8: lifecycle profile setting in LEAP.</w:t>
-      </w:r>
-    </w:p>
-    <w:p>
-      <w:pPr>
-        <w:jc w:val="center"/>
-      </w:pPr>
-      <w:r>
-        <w:rPr>
-          <w:noProof/>
-        </w:rPr>
-        <w:drawing>
-          <wp:inline distT="0" distB="0" distL="0" distR="0" wp14:anchorId="61DA24A0" wp14:editId="08BBEB57">
-            <wp:extent cx="5669280" cy="3266358"/>
-            <wp:effectExtent l="0" t="0" r="0" b="0"/>
-            <wp:docPr id="9" name="Picture 9"/>
-            <wp:cNvGraphicFramePr>
-              <a:graphicFrameLocks xmlns:a="http://schemas.openxmlformats.org/drawingml/2006/main" noChangeAspect="1"/>
-            </wp:cNvGraphicFramePr>
-            <a:graphic xmlns:a="http://schemas.openxmlformats.org/drawingml/2006/main">
-              <a:graphicData uri="http://schemas.openxmlformats.org/drawingml/2006/picture">
-                <pic:pic xmlns:pic="http://schemas.openxmlformats.org/drawingml/2006/picture">
-                  <pic:nvPicPr>
-                    <pic:cNvPr id="0" name="09_p025_rId14_1.png"/>
-                    <pic:cNvPicPr/>
-                  </pic:nvPicPr>
-                  <pic:blipFill>
-                    <a:blip r:embed="rId22"/>
-                    <a:stretch>
-                      <a:fillRect/>
-                    </a:stretch>
-                  </pic:blipFill>
-                  <pic:spPr>
-                    <a:xfrm>
-                      <a:off x="0" y="0"/>
-                      <a:ext cx="5669280" cy="3266358"/>
-                    </a:xfrm>
-                    <a:prstGeom prst="rect">
-                      <a:avLst/>
-                    </a:prstGeom>
-                  </pic:spPr>
-                </pic:pic>
-              </a:graphicData>
-            </a:graphic>
-          </wp:inline>
-        </w:drawing>
-      </w:r>
-    </w:p>
-    <w:p>
-      <w:pPr>
-        <w:jc w:val="center"/>
-      </w:pPr>
-      <w:r>
-        <w:rPr>
-          <w:i/>
-          <w:color w:val="595959"/>
-          <w:sz w:val="16"/>
-        </w:rPr>
-        <w:t>Original guide screenshot 9: lifecycle profile setting in LEAP.</w:t>
-      </w:r>
-    </w:p>
-    <w:p>
-      <w:pPr>
-        <w:jc w:val="center"/>
-      </w:pPr>
-      <w:r>
-        <w:rPr>
-          <w:noProof/>
-        </w:rPr>
-        <w:lastRenderedPageBreak/>
-        <w:drawing>
-          <wp:inline distT="0" distB="0" distL="0" distR="0" wp14:anchorId="2C401A96" wp14:editId="3248A5E3">
-            <wp:extent cx="5669280" cy="2140899"/>
-            <wp:effectExtent l="0" t="0" r="0" b="0"/>
-            <wp:docPr id="10" name="Picture 10"/>
-            <wp:cNvGraphicFramePr>
-              <a:graphicFrameLocks xmlns:a="http://schemas.openxmlformats.org/drawingml/2006/main" noChangeAspect="1"/>
-            </wp:cNvGraphicFramePr>
-            <a:graphic xmlns:a="http://schemas.openxmlformats.org/drawingml/2006/main">
-              <a:graphicData uri="http://schemas.openxmlformats.org/drawingml/2006/picture">
-                <pic:pic xmlns:pic="http://schemas.openxmlformats.org/drawingml/2006/picture">
-                  <pic:nvPicPr>
-                    <pic:cNvPr id="0" name="10_p026_rId15_1.png"/>
-                    <pic:cNvPicPr/>
-                  </pic:nvPicPr>
-                  <pic:blipFill>
-                    <a:blip r:embed="rId23"/>
-                    <a:stretch>
-                      <a:fillRect/>
-                    </a:stretch>
-                  </pic:blipFill>
-                  <pic:spPr>
-                    <a:xfrm>
-                      <a:off x="0" y="0"/>
-                      <a:ext cx="5669280" cy="2140899"/>
-                    </a:xfrm>
-                    <a:prstGeom prst="rect">
-                      <a:avLst/>
-                    </a:prstGeom>
-                  </pic:spPr>
-                </pic:pic>
-              </a:graphicData>
-            </a:graphic>
-          </wp:inline>
-        </w:drawing>
-      </w:r>
-    </w:p>
-    <w:p>
-      <w:pPr>
-        <w:jc w:val="center"/>
-      </w:pPr>
-      <w:r>
-        <w:rPr>
-          <w:i/>
-          <w:color w:val="595959"/>
-          <w:sz w:val="16"/>
-        </w:rPr>
-        <w:t>Original guide screenshot 10: lifecycle profile setting in LEAP.</w:t>
-      </w:r>
-    </w:p>
-    <w:p>
-      <w:pPr>
-        <w:jc w:val="center"/>
-      </w:pPr>
-      <w:r>
-        <w:rPr>
-          <w:noProof/>
-        </w:rPr>
-        <w:drawing>
-          <wp:inline distT="0" distB="0" distL="0" distR="0" wp14:anchorId="2810D48D" wp14:editId="28B6EBF5">
-            <wp:extent cx="5669280" cy="2978774"/>
-            <wp:effectExtent l="0" t="0" r="0" b="0"/>
-            <wp:docPr id="11" name="Picture 11"/>
-            <wp:cNvGraphicFramePr>
-              <a:graphicFrameLocks xmlns:a="http://schemas.openxmlformats.org/drawingml/2006/main" noChangeAspect="1"/>
-            </wp:cNvGraphicFramePr>
-            <a:graphic xmlns:a="http://schemas.openxmlformats.org/drawingml/2006/main">
-              <a:graphicData uri="http://schemas.openxmlformats.org/drawingml/2006/picture">
-                <pic:pic xmlns:pic="http://schemas.openxmlformats.org/drawingml/2006/picture">
-                  <pic:nvPicPr>
-                    <pic:cNvPr id="0" name="11_p028_rId16_1.png"/>
-                    <pic:cNvPicPr/>
-                  </pic:nvPicPr>
-                  <pic:blipFill>
-                    <a:blip r:embed="rId24"/>
-                    <a:stretch>
-                      <a:fillRect/>
-                    </a:stretch>
-                  </pic:blipFill>
-                  <pic:spPr>
-                    <a:xfrm>
-                      <a:off x="0" y="0"/>
-                      <a:ext cx="5669280" cy="2978774"/>
-                    </a:xfrm>
-                    <a:prstGeom prst="rect">
-                      <a:avLst/>
-                    </a:prstGeom>
-                  </pic:spPr>
-                </pic:pic>
-              </a:graphicData>
-            </a:graphic>
-          </wp:inline>
-        </w:drawing>
-      </w:r>
-    </w:p>
-    <w:p>
-      <w:pPr>
-        <w:jc w:val="center"/>
-      </w:pPr>
-      <w:r>
-        <w:rPr>
-          <w:i/>
-          <w:color w:val="595959"/>
-          <w:sz w:val="16"/>
-        </w:rPr>
-        <w:t>Original guide screenshot 11: lifecycle profile setting in LEAP.</w:t>
-      </w:r>
-    </w:p>
-    <w:p>
-      <w:pPr>
-        <w:jc w:val="center"/>
-      </w:pPr>
-      <w:r>
-        <w:rPr>
-          <w:noProof/>
-        </w:rPr>
-        <w:drawing>
-          <wp:inline distT="0" distB="0" distL="0" distR="0" wp14:anchorId="0C86DB77" wp14:editId="2C9E2652">
-            <wp:extent cx="5669280" cy="1551490"/>
-            <wp:effectExtent l="0" t="0" r="0" b="0"/>
-            <wp:docPr id="12" name="Picture 12"/>
-            <wp:cNvGraphicFramePr>
-              <a:graphicFrameLocks xmlns:a="http://schemas.openxmlformats.org/drawingml/2006/main" noChangeAspect="1"/>
-            </wp:cNvGraphicFramePr>
-            <a:graphic xmlns:a="http://schemas.openxmlformats.org/drawingml/2006/main">
-              <a:graphicData uri="http://schemas.openxmlformats.org/drawingml/2006/picture">
-                <pic:pic xmlns:pic="http://schemas.openxmlformats.org/drawingml/2006/picture">
-                  <pic:nvPicPr>
-                    <pic:cNvPr id="0" name="12_p029_rId17_1.png"/>
-                    <pic:cNvPicPr/>
-                  </pic:nvPicPr>
-                  <pic:blipFill>
-                    <a:blip r:embed="rId25"/>
-                    <a:stretch>
-                      <a:fillRect/>
-                    </a:stretch>
-                  </pic:blipFill>
-                  <pic:spPr>
-                    <a:xfrm>
-                      <a:off x="0" y="0"/>
-                      <a:ext cx="5669280" cy="1551490"/>
-                    </a:xfrm>
-                    <a:prstGeom prst="rect">
-                      <a:avLst/>
-                    </a:prstGeom>
-                  </pic:spPr>
-                </pic:pic>
-              </a:graphicData>
-            </a:graphic>
-          </wp:inline>
-        </w:drawing>
-      </w:r>
-    </w:p>
-    <w:p>
-      <w:pPr>
-        <w:jc w:val="center"/>
-      </w:pPr>
-      <w:r>
-        <w:rPr>
-          <w:i/>
-          <w:color w:val="595959"/>
-          <w:sz w:val="16"/>
-        </w:rPr>
-        <w:t>Original guide screenshot 12: lifecycle profile setting in LEAP.</w:t>
-      </w:r>
-    </w:p>
-    <w:p>
-      <w:pPr>
-        <w:jc w:val="center"/>
-      </w:pPr>
-      <w:r>
-        <w:rPr>
-          <w:noProof/>
-        </w:rPr>
-        <w:lastRenderedPageBreak/>
-        <w:drawing>
-          <wp:inline distT="0" distB="0" distL="0" distR="0" wp14:anchorId="4A30D335" wp14:editId="4E2373AA">
-            <wp:extent cx="3711388" cy="3840480"/>
-            <wp:effectExtent l="0" t="0" r="0" b="0"/>
-            <wp:docPr id="13" name="Picture 13"/>
-            <wp:cNvGraphicFramePr>
-              <a:graphicFrameLocks xmlns:a="http://schemas.openxmlformats.org/drawingml/2006/main" noChangeAspect="1"/>
-            </wp:cNvGraphicFramePr>
-            <a:graphic xmlns:a="http://schemas.openxmlformats.org/drawingml/2006/main">
-              <a:graphicData uri="http://schemas.openxmlformats.org/drawingml/2006/picture">
-                <pic:pic xmlns:pic="http://schemas.openxmlformats.org/drawingml/2006/picture">
-                  <pic:nvPicPr>
-                    <pic:cNvPr id="0" name="13_p058_rId18_1.png"/>
-                    <pic:cNvPicPr/>
-                  </pic:nvPicPr>
-                  <pic:blipFill>
-                    <a:blip r:embed="rId26"/>
-                    <a:stretch>
-                      <a:fillRect/>
-                    </a:stretch>
-                  </pic:blipFill>
-                  <pic:spPr>
-                    <a:xfrm>
-                      <a:off x="0" y="0"/>
-                      <a:ext cx="3711388" cy="3840480"/>
-                    </a:xfrm>
-                    <a:prstGeom prst="rect">
-                      <a:avLst/>
-                    </a:prstGeom>
-                  </pic:spPr>
-                </pic:pic>
-              </a:graphicData>
-            </a:graphic>
-          </wp:inline>
-        </w:drawing>
-      </w:r>
-    </w:p>
-    <w:p>
-      <w:pPr>
-        <w:jc w:val="center"/>
-      </w:pPr>
-      <w:r>
-        <w:rPr>
-          <w:i/>
-          <w:color w:val="595959"/>
-          <w:sz w:val="16"/>
-        </w:rPr>
-        <w:t>Original guide screenshot 13: lifecycle profile setting in LEAP.</w:t>
+        <w:t>For passenger branches, set the Sales Share Survival Profile to Passenger_vehicle_survival. No profile is required in Sales.</w:t>
       </w:r>
     </w:p>
     <w:tbl>
@@ -3247,6 +2888,59 @@
         </w:tc>
       </w:tr>
     </w:tbl>
+    <w:p>
+      <w:pPr>
+        <w:keepNext/>
+        <w:jc w:val="center"/>
+      </w:pPr>
+      <w:r>
+        <w:drawing>
+          <wp:inline xmlns:a="http://schemas.openxmlformats.org/drawingml/2006/main" xmlns:pic="http://schemas.openxmlformats.org/drawingml/2006/picture">
+            <wp:extent cx="5669280" cy="3285054"/>
+            <wp:docPr id="1521496003" name="Picture 1521496003"/>
+            <wp:cNvGraphicFramePr>
+              <a:graphicFrameLocks noChangeAspect="1"/>
+            </wp:cNvGraphicFramePr>
+            <a:graphic>
+              <a:graphicData uri="http://schemas.openxmlformats.org/drawingml/2006/picture">
+                <pic:pic>
+                  <pic:nvPicPr>
+                    <pic:cNvPr id="0" name="mielage and economy profiles needed.png"/>
+                    <pic:cNvPicPr/>
+                  </pic:nvPicPr>
+                  <pic:blipFill>
+                    <a:blip r:embed="rId45"/>
+                    <a:stretch>
+                      <a:fillRect/>
+                    </a:stretch>
+                  </pic:blipFill>
+                  <pic:spPr>
+                    <a:xfrm>
+                      <a:off x="0" y="0"/>
+                      <a:ext cx="5669280" cy="3285054"/>
+                    </a:xfrm>
+                    <a:prstGeom prst="rect"/>
+                  </pic:spPr>
+                </pic:pic>
+              </a:graphicData>
+            </a:graphic>
+          </wp:inline>
+        </w:drawing>
+      </w:r>
+    </w:p>
+    <w:p>
+      <w:pPr>
+        <w:jc w:val="center"/>
+      </w:pPr>
+      <w:r>
+        <w:rPr>
+          <w:i/>
+          <w:color w:val="595959"/>
+          <w:sz w:val="16"/>
+        </w:rPr>
+        <w:t>Mileage and Fuel Economy both require a Degradation Profile. In LEAP, add a profile named Constant and select the workbook range Constant; the web app has already filled it with 100 at every vehicle age/year. Then assign Constant to both variables.</w:t>
+      </w:r>
+    </w:p>
     <w:p>
       <w:pPr>
         <w:pStyle w:val="Heading1"/>

</xml_diff>

<commit_message>
codex: improve Constant lifecycle profile guidance
Adds the import, Mileage, and Fuel Economy screenshots. Verified all 21 rendered pages and checked section picture counts and required guidance text.
</commit_message>
<xml_diff>
--- a/docs/docx/Transport guide for LEAP.docx
+++ b/docs/docx/Transport guide for LEAP.docx
@@ -2570,8 +2570,8 @@
       <w:r>
         <w:drawing>
           <wp:inline xmlns:a="http://schemas.openxmlformats.org/drawingml/2006/main" xmlns:pic="http://schemas.openxmlformats.org/drawingml/2006/picture">
-            <wp:extent cx="5669280" cy="3171387"/>
-            <wp:docPr id="1521495999" name="Picture 1521495999"/>
+            <wp:extent cx="5669280" cy="2832370"/>
+            <wp:docPr id="1521496004" name="Picture 1521496004"/>
             <wp:cNvGraphicFramePr>
               <a:graphicFrameLocks noChangeAspect="1"/>
             </wp:cNvGraphicFramePr>
@@ -2579,11 +2579,11 @@
               <a:graphicData uri="http://schemas.openxmlformats.org/drawingml/2006/picture">
                 <pic:pic>
                   <pic:nvPicPr>
-                    <pic:cNvPr id="0" name="freight vehicle survival 2.png"/>
+                    <pic:cNvPr id="0" name="setting constant profiles 1.png"/>
                     <pic:cNvPicPr/>
                   </pic:nvPicPr>
                   <pic:blipFill>
-                    <a:blip r:embed="rId41"/>
+                    <a:blip r:embed="rId46"/>
                     <a:stretch>
                       <a:fillRect/>
                     </a:stretch>
@@ -2591,7 +2591,7 @@
                   <pic:spPr>
                     <a:xfrm>
                       <a:off x="0" y="0"/>
-                      <a:ext cx="5669280" cy="3171387"/>
+                      <a:ext cx="5669280" cy="2832370"/>
                     </a:xfrm>
                     <a:prstGeom prst="rect"/>
                   </pic:spPr>
@@ -2612,7 +2612,7 @@
           <w:color w:val="595959"/>
           <w:sz w:val="16"/>
         </w:rPr>
-        <w:t>Step 3: Click Import and choose the named range with that same profile sheet name.</w:t>
+        <w:t>Step 3: For Constant, click Import, choose the workbook range Constant, and select OK. Confirm that the preview remains at 100 for every vehicle age.</w:t>
       </w:r>
     </w:p>
     <w:p>
@@ -2670,7 +2670,7 @@
         <w:pStyle w:val="ListBullet"/>
       </w:pPr>
       <w:r>
-        <w:t>Mileage and Fuel Economy: set Degradation Profile to Constant. The downloaded lifecycle workbook already includes the Constant sheet and named range, with 100 at every vehicle age/year.</w:t>
+        <w:t>Mileage and Fuel Economy: set Degradation Profile to Constant for every displayed fuel row. The downloaded lifecycle workbook already includes the Constant sheet and named range, with 100 at every vehicle age/year.</w:t>
       </w:r>
     </w:p>
     <w:p>
@@ -2896,8 +2896,8 @@
       <w:r>
         <w:drawing>
           <wp:inline xmlns:a="http://schemas.openxmlformats.org/drawingml/2006/main" xmlns:pic="http://schemas.openxmlformats.org/drawingml/2006/picture">
-            <wp:extent cx="5669280" cy="3285054"/>
-            <wp:docPr id="1521496003" name="Picture 1521496003"/>
+            <wp:extent cx="5669280" cy="1769531"/>
+            <wp:docPr id="1521496005" name="Picture 1521496005"/>
             <wp:cNvGraphicFramePr>
               <a:graphicFrameLocks noChangeAspect="1"/>
             </wp:cNvGraphicFramePr>
@@ -2905,11 +2905,11 @@
               <a:graphicData uri="http://schemas.openxmlformats.org/drawingml/2006/picture">
                 <pic:pic>
                   <pic:nvPicPr>
-                    <pic:cNvPr id="0" name="mielage and economy profiles needed.png"/>
+                    <pic:cNvPr id="0" name="setting constant profiles 2.png"/>
                     <pic:cNvPicPr/>
                   </pic:nvPicPr>
                   <pic:blipFill>
-                    <a:blip r:embed="rId45"/>
+                    <a:blip r:embed="rId47"/>
                     <a:stretch>
                       <a:fillRect/>
                     </a:stretch>
@@ -2917,7 +2917,7 @@
                   <pic:spPr>
                     <a:xfrm>
                       <a:off x="0" y="0"/>
-                      <a:ext cx="5669280" cy="3285054"/>
+                      <a:ext cx="5669280" cy="1769531"/>
                     </a:xfrm>
                     <a:prstGeom prst="rect"/>
                   </pic:spPr>
@@ -2938,7 +2938,60 @@
           <w:color w:val="595959"/>
           <w:sz w:val="16"/>
         </w:rPr>
-        <w:t>Mileage and Fuel Economy both require a Degradation Profile. In LEAP, add a profile named Constant and select the workbook range Constant; the web app has already filled it with 100 at every vehicle age/year. Then assign Constant to both variables.</w:t>
+        <w:t>In Mileage, set Degradation Profile to Constant for every displayed fuel row. Use Ctrl+D to copy the setting down where appropriate, then check that no row is blank.</w:t>
+      </w:r>
+    </w:p>
+    <w:p>
+      <w:pPr>
+        <w:keepNext/>
+        <w:jc w:val="center"/>
+      </w:pPr>
+      <w:r>
+        <w:drawing>
+          <wp:inline xmlns:a="http://schemas.openxmlformats.org/drawingml/2006/main" xmlns:pic="http://schemas.openxmlformats.org/drawingml/2006/picture">
+            <wp:extent cx="5669280" cy="2362480"/>
+            <wp:docPr id="1521496006" name="Picture 1521496006"/>
+            <wp:cNvGraphicFramePr>
+              <a:graphicFrameLocks noChangeAspect="1"/>
+            </wp:cNvGraphicFramePr>
+            <a:graphic>
+              <a:graphicData uri="http://schemas.openxmlformats.org/drawingml/2006/picture">
+                <pic:pic>
+                  <pic:nvPicPr>
+                    <pic:cNvPr id="0" name="setting constant profiles 3.png"/>
+                    <pic:cNvPicPr/>
+                  </pic:nvPicPr>
+                  <pic:blipFill>
+                    <a:blip r:embed="rId48"/>
+                    <a:stretch>
+                      <a:fillRect/>
+                    </a:stretch>
+                  </pic:blipFill>
+                  <pic:spPr>
+                    <a:xfrm>
+                      <a:off x="0" y="0"/>
+                      <a:ext cx="5669280" cy="2362480"/>
+                    </a:xfrm>
+                    <a:prstGeom prst="rect"/>
+                  </pic:spPr>
+                </pic:pic>
+              </a:graphicData>
+            </a:graphic>
+          </wp:inline>
+        </w:drawing>
+      </w:r>
+    </w:p>
+    <w:p>
+      <w:pPr>
+        <w:jc w:val="center"/>
+      </w:pPr>
+      <w:r>
+        <w:rPr>
+          <w:i/>
+          <w:color w:val="595959"/>
+          <w:sz w:val="16"/>
+        </w:rPr>
+        <w:t>In Fuel Economy, set Degradation Profile to Constant for every displayed fuel row. Check all fuels, including rows near the bottom of the list.</w:t>
       </w:r>
     </w:p>
     <w:p>

</xml_diff>

<commit_message>
codex: document prepared road branch import
Adds branch-import screenshots and instructions for removing the placeholder road branch, importing freight and passenger road structures, adding missing lifecycle profiles, and overwriting their values for the economy. Rendered and visually checked all 23 pages.
</commit_message>
<xml_diff>
--- a/docs/docx/Transport guide for LEAP.docx
+++ b/docs/docx/Transport guide for LEAP.docx
@@ -2331,6 +2331,162 @@
         </w:tc>
       </w:tr>
     </w:tbl>
+    <w:p>
+      <w:pPr>
+        <w:pStyle w:val="Heading2"/>
+      </w:pPr>
+      <w:r>
+        <w:t>5.4 Import the road branches</w:t>
+      </w:r>
+    </w:p>
+    <w:p>
+      <w:r>
+        <w:t>After importing the workbook expressions, import both prepared road branches into the Demand branch: Freight road and Passenger road. Choose Add Missing Lifecycle Profiles so LEAP brings in profiles that are not already present. You can then overwrite the imported profile values with your economy-specific values instead of recreating profiles for every variable.</w:t>
+      </w:r>
+    </w:p>
+    <w:p>
+      <w:pPr>
+        <w:ind w:left="360" w:hanging="360"/>
+      </w:pPr>
+      <w:r>
+        <w:t>1. If the placeholder Demand\All demand aggregated\Road branch is present, delete it before importing the prepared road branches.</w:t>
+      </w:r>
+    </w:p>
+    <w:p>
+      <w:pPr>
+        <w:ind w:left="360" w:hanging="360"/>
+      </w:pPr>
+      <w:r>
+        <w:t>2. In the LEAP Area tree, right-click Demand and choose Insert Branches From Other Area.</w:t>
+      </w:r>
+    </w:p>
+    <w:p>
+      <w:pPr>
+        <w:keepNext/>
+        <w:jc w:val="center"/>
+      </w:pPr>
+      <w:r>
+        <w:drawing>
+          <wp:inline xmlns:a="http://schemas.openxmlformats.org/drawingml/2006/main" xmlns:pic="http://schemas.openxmlformats.org/drawingml/2006/picture">
+            <wp:extent cx="5669280" cy="9041312"/>
+            <wp:docPr id="1521496007" name="Picture 1521496007"/>
+            <wp:cNvGraphicFramePr>
+              <a:graphicFrameLocks noChangeAspect="1"/>
+            </wp:cNvGraphicFramePr>
+            <a:graphic>
+              <a:graphicData uri="http://schemas.openxmlformats.org/drawingml/2006/picture">
+                <pic:pic>
+                  <pic:nvPicPr>
+                    <pic:cNvPr id="0" name="branchimport0.png"/>
+                    <pic:cNvPicPr/>
+                  </pic:nvPicPr>
+                  <pic:blipFill>
+                    <a:blip r:embed="rId49"/>
+                    <a:stretch>
+                      <a:fillRect/>
+                    </a:stretch>
+                  </pic:blipFill>
+                  <pic:spPr>
+                    <a:xfrm>
+                      <a:off x="0" y="0"/>
+                      <a:ext cx="5669280" cy="9041312"/>
+                    </a:xfrm>
+                    <a:prstGeom prst="rect"/>
+                  </pic:spPr>
+                </pic:pic>
+              </a:graphicData>
+            </a:graphic>
+          </wp:inline>
+        </w:drawing>
+      </w:r>
+    </w:p>
+    <w:p>
+      <w:pPr>
+        <w:jc w:val="center"/>
+      </w:pPr>
+      <w:r>
+        <w:rPr>
+          <w:i/>
+          <w:color w:val="595959"/>
+          <w:sz w:val="16"/>
+        </w:rPr>
+        <w:t>Step 1: Right-click the Demand branch and choose Insert Branches From Other Area.</w:t>
+      </w:r>
+    </w:p>
+    <w:p>
+      <w:pPr>
+        <w:ind w:left="360" w:hanging="360"/>
+      </w:pPr>
+      <w:r>
+        <w:t>3. In Import Settings, select the prepared source area, choose Demand\Freight road, set Lifecycle Profiles to Add Missing Lifecycle Profiles, keep Import structure only (no data) selected, and click OK.</w:t>
+      </w:r>
+    </w:p>
+    <w:p>
+      <w:pPr>
+        <w:keepNext/>
+        <w:jc w:val="center"/>
+      </w:pPr>
+      <w:r>
+        <w:drawing>
+          <wp:inline xmlns:a="http://schemas.openxmlformats.org/drawingml/2006/main" xmlns:pic="http://schemas.openxmlformats.org/drawingml/2006/picture">
+            <wp:extent cx="5669280" cy="1699715"/>
+            <wp:docPr id="1521496008" name="Picture 1521496008"/>
+            <wp:cNvGraphicFramePr>
+              <a:graphicFrameLocks noChangeAspect="1"/>
+            </wp:cNvGraphicFramePr>
+            <a:graphic>
+              <a:graphicData uri="http://schemas.openxmlformats.org/drawingml/2006/picture">
+                <pic:pic>
+                  <pic:nvPicPr>
+                    <pic:cNvPr id="0" name="branchimport.png"/>
+                    <pic:cNvPicPr/>
+                  </pic:nvPicPr>
+                  <pic:blipFill>
+                    <a:blip r:embed="rId50"/>
+                    <a:stretch>
+                      <a:fillRect/>
+                    </a:stretch>
+                  </pic:blipFill>
+                  <pic:spPr>
+                    <a:xfrm>
+                      <a:off x="0" y="0"/>
+                      <a:ext cx="5669280" cy="1699715"/>
+                    </a:xfrm>
+                    <a:prstGeom prst="rect"/>
+                  </pic:spPr>
+                </pic:pic>
+              </a:graphicData>
+            </a:graphic>
+          </wp:inline>
+        </w:drawing>
+      </w:r>
+    </w:p>
+    <w:p>
+      <w:pPr>
+        <w:jc w:val="center"/>
+      </w:pPr>
+      <w:r>
+        <w:rPr>
+          <w:i/>
+          <w:color w:val="595959"/>
+          <w:sz w:val="16"/>
+        </w:rPr>
+        <w:t>Step 2: Import Demand\Freight road with Add Missing Lifecycle Profiles and Import structure only (no data).</w:t>
+      </w:r>
+    </w:p>
+    <w:p>
+      <w:pPr>
+        <w:ind w:left="360" w:hanging="360"/>
+      </w:pPr>
+      <w:r>
+        <w:t>4. Repeat the import for Demand\Passenger road, using the same Add Missing Lifecycle Profiles and structure-only settings.</w:t>
+      </w:r>
+    </w:p>
+    <w:p>
+      <w:r>
+        <w:t>The imported lifecycle profiles are ready to select later. Update their values for the economy where needed; do not create a separate profile again for every variable.</w:t>
+      </w:r>
+    </w:p>
     <w:p>
       <w:pPr>
         <w:pStyle w:val="Heading1"/>

</xml_diff>

<commit_message>
codex: place branch import before workbook import
Moves branch existence and import guidance to section 5.3, renumbers workbook import to 5.4, and starts with a check for existing road branches. Rendered and visually checked all 24 pages.
</commit_message>
<xml_diff>
--- a/docs/docx/Transport guide for LEAP.docx
+++ b/docs/docx/Transport guide for LEAP.docx
@@ -2110,7 +2110,163 @@
         <w:pStyle w:val="Heading2"/>
       </w:pPr>
       <w:r>
-        <w:t>5.3 Import the LEAP workbook</w:t>
+        <w:t>5.3 Import the road branches</w:t>
+      </w:r>
+    </w:p>
+    <w:p>
+      <w:r>
+        <w:t>Note: Before importing, check whether Demand already contains Freight road and Passenger road. If both branches are present, do not import them again; continue to section 5.4. If either branch is missing, use the steps below. If the placeholder Demand\All demand aggregated\Road branch is present, delete it before importing.</w:t>
+      </w:r>
+    </w:p>
+    <w:p>
+      <w:pPr>
+        <w:ind w:left="360" w:hanging="360"/>
+      </w:pPr>
+      <w:r>
+        <w:t>1. If the placeholder Demand\All demand aggregated\Road branch is present, delete it before importing the prepared road branches.</w:t>
+      </w:r>
+    </w:p>
+    <w:p>
+      <w:pPr>
+        <w:ind w:left="360" w:hanging="360"/>
+      </w:pPr>
+      <w:r>
+        <w:t>2. In the LEAP Area tree, right-click Demand and choose Insert Branches From Other Area.</w:t>
+      </w:r>
+    </w:p>
+    <w:p>
+      <w:pPr>
+        <w:keepNext/>
+        <w:jc w:val="center"/>
+      </w:pPr>
+      <w:r>
+        <w:drawing>
+          <wp:inline xmlns:a="http://schemas.openxmlformats.org/drawingml/2006/main" xmlns:pic="http://schemas.openxmlformats.org/drawingml/2006/picture">
+            <wp:extent cx="5669280" cy="9041312"/>
+            <wp:docPr id="1521496007" name="Picture 1521496007"/>
+            <wp:cNvGraphicFramePr>
+              <a:graphicFrameLocks noChangeAspect="1"/>
+            </wp:cNvGraphicFramePr>
+            <a:graphic>
+              <a:graphicData uri="http://schemas.openxmlformats.org/drawingml/2006/picture">
+                <pic:pic>
+                  <pic:nvPicPr>
+                    <pic:cNvPr id="0" name="branchimport0.png"/>
+                    <pic:cNvPicPr/>
+                  </pic:nvPicPr>
+                  <pic:blipFill>
+                    <a:blip r:embed="rId49"/>
+                    <a:stretch>
+                      <a:fillRect/>
+                    </a:stretch>
+                  </pic:blipFill>
+                  <pic:spPr>
+                    <a:xfrm>
+                      <a:off x="0" y="0"/>
+                      <a:ext cx="5669280" cy="9041312"/>
+                    </a:xfrm>
+                    <a:prstGeom prst="rect"/>
+                  </pic:spPr>
+                </pic:pic>
+              </a:graphicData>
+            </a:graphic>
+          </wp:inline>
+        </w:drawing>
+      </w:r>
+    </w:p>
+    <w:p>
+      <w:pPr>
+        <w:jc w:val="center"/>
+      </w:pPr>
+      <w:r>
+        <w:rPr>
+          <w:i/>
+          <w:color w:val="595959"/>
+          <w:sz w:val="16"/>
+        </w:rPr>
+        <w:t>Step 1: Right-click the Demand branch and choose Insert Branches From Other Area.</w:t>
+      </w:r>
+    </w:p>
+    <w:p>
+      <w:pPr>
+        <w:ind w:left="360" w:hanging="360"/>
+      </w:pPr>
+      <w:r>
+        <w:t>3. In Import Settings, select the prepared source area, choose Demand\Freight road, set Lifecycle Profiles to Add Missing Lifecycle Profiles, keep Import structure only (no data) selected, and click OK.</w:t>
+      </w:r>
+    </w:p>
+    <w:p>
+      <w:pPr>
+        <w:keepNext/>
+        <w:jc w:val="center"/>
+      </w:pPr>
+      <w:r>
+        <w:drawing>
+          <wp:inline xmlns:a="http://schemas.openxmlformats.org/drawingml/2006/main" xmlns:pic="http://schemas.openxmlformats.org/drawingml/2006/picture">
+            <wp:extent cx="5669280" cy="1699715"/>
+            <wp:docPr id="1521496008" name="Picture 1521496008"/>
+            <wp:cNvGraphicFramePr>
+              <a:graphicFrameLocks noChangeAspect="1"/>
+            </wp:cNvGraphicFramePr>
+            <a:graphic>
+              <a:graphicData uri="http://schemas.openxmlformats.org/drawingml/2006/picture">
+                <pic:pic>
+                  <pic:nvPicPr>
+                    <pic:cNvPr id="0" name="branchimport.png"/>
+                    <pic:cNvPicPr/>
+                  </pic:nvPicPr>
+                  <pic:blipFill>
+                    <a:blip r:embed="rId50"/>
+                    <a:stretch>
+                      <a:fillRect/>
+                    </a:stretch>
+                  </pic:blipFill>
+                  <pic:spPr>
+                    <a:xfrm>
+                      <a:off x="0" y="0"/>
+                      <a:ext cx="5669280" cy="1699715"/>
+                    </a:xfrm>
+                    <a:prstGeom prst="rect"/>
+                  </pic:spPr>
+                </pic:pic>
+              </a:graphicData>
+            </a:graphic>
+          </wp:inline>
+        </w:drawing>
+      </w:r>
+    </w:p>
+    <w:p>
+      <w:pPr>
+        <w:jc w:val="center"/>
+      </w:pPr>
+      <w:r>
+        <w:rPr>
+          <w:i/>
+          <w:color w:val="595959"/>
+          <w:sz w:val="16"/>
+        </w:rPr>
+        <w:t>Step 2: Import Demand\Freight road with Add Missing Lifecycle Profiles and Import structure only (no data).</w:t>
+      </w:r>
+    </w:p>
+    <w:p>
+      <w:pPr>
+        <w:ind w:left="360" w:hanging="360"/>
+      </w:pPr>
+      <w:r>
+        <w:t>4. Repeat the import for Demand\Passenger road, using the same Add Missing Lifecycle Profiles and structure-only settings.</w:t>
+      </w:r>
+    </w:p>
+    <w:p>
+      <w:r>
+        <w:t>The imported lifecycle profiles are ready to select later. Update their values for the economy where needed; do not create a separate profile again for every variable.</w:t>
+      </w:r>
+    </w:p>
+    <w:p>
+      <w:pPr>
+        <w:pStyle w:val="Heading2"/>
+      </w:pPr>
+      <w:r>
+        <w:t>5.4 Import the LEAP workbook</w:t>
       </w:r>
     </w:p>
     <w:p>
@@ -2333,162 +2489,6 @@
     </w:tbl>
     <w:p>
       <w:pPr>
-        <w:pStyle w:val="Heading2"/>
-      </w:pPr>
-      <w:r>
-        <w:t>5.4 Import the road branches</w:t>
-      </w:r>
-    </w:p>
-    <w:p>
-      <w:r>
-        <w:t>After importing the workbook expressions, import both prepared road branches into the Demand branch: Freight road and Passenger road. Choose Add Missing Lifecycle Profiles so LEAP brings in profiles that are not already present. You can then overwrite the imported profile values with your economy-specific values instead of recreating profiles for every variable.</w:t>
-      </w:r>
-    </w:p>
-    <w:p>
-      <w:pPr>
-        <w:ind w:left="360" w:hanging="360"/>
-      </w:pPr>
-      <w:r>
-        <w:t>1. If the placeholder Demand\All demand aggregated\Road branch is present, delete it before importing the prepared road branches.</w:t>
-      </w:r>
-    </w:p>
-    <w:p>
-      <w:pPr>
-        <w:ind w:left="360" w:hanging="360"/>
-      </w:pPr>
-      <w:r>
-        <w:t>2. In the LEAP Area tree, right-click Demand and choose Insert Branches From Other Area.</w:t>
-      </w:r>
-    </w:p>
-    <w:p>
-      <w:pPr>
-        <w:keepNext/>
-        <w:jc w:val="center"/>
-      </w:pPr>
-      <w:r>
-        <w:drawing>
-          <wp:inline xmlns:a="http://schemas.openxmlformats.org/drawingml/2006/main" xmlns:pic="http://schemas.openxmlformats.org/drawingml/2006/picture">
-            <wp:extent cx="5669280" cy="9041312"/>
-            <wp:docPr id="1521496007" name="Picture 1521496007"/>
-            <wp:cNvGraphicFramePr>
-              <a:graphicFrameLocks noChangeAspect="1"/>
-            </wp:cNvGraphicFramePr>
-            <a:graphic>
-              <a:graphicData uri="http://schemas.openxmlformats.org/drawingml/2006/picture">
-                <pic:pic>
-                  <pic:nvPicPr>
-                    <pic:cNvPr id="0" name="branchimport0.png"/>
-                    <pic:cNvPicPr/>
-                  </pic:nvPicPr>
-                  <pic:blipFill>
-                    <a:blip r:embed="rId49"/>
-                    <a:stretch>
-                      <a:fillRect/>
-                    </a:stretch>
-                  </pic:blipFill>
-                  <pic:spPr>
-                    <a:xfrm>
-                      <a:off x="0" y="0"/>
-                      <a:ext cx="5669280" cy="9041312"/>
-                    </a:xfrm>
-                    <a:prstGeom prst="rect"/>
-                  </pic:spPr>
-                </pic:pic>
-              </a:graphicData>
-            </a:graphic>
-          </wp:inline>
-        </w:drawing>
-      </w:r>
-    </w:p>
-    <w:p>
-      <w:pPr>
-        <w:jc w:val="center"/>
-      </w:pPr>
-      <w:r>
-        <w:rPr>
-          <w:i/>
-          <w:color w:val="595959"/>
-          <w:sz w:val="16"/>
-        </w:rPr>
-        <w:t>Step 1: Right-click the Demand branch and choose Insert Branches From Other Area.</w:t>
-      </w:r>
-    </w:p>
-    <w:p>
-      <w:pPr>
-        <w:ind w:left="360" w:hanging="360"/>
-      </w:pPr>
-      <w:r>
-        <w:t>3. In Import Settings, select the prepared source area, choose Demand\Freight road, set Lifecycle Profiles to Add Missing Lifecycle Profiles, keep Import structure only (no data) selected, and click OK.</w:t>
-      </w:r>
-    </w:p>
-    <w:p>
-      <w:pPr>
-        <w:keepNext/>
-        <w:jc w:val="center"/>
-      </w:pPr>
-      <w:r>
-        <w:drawing>
-          <wp:inline xmlns:a="http://schemas.openxmlformats.org/drawingml/2006/main" xmlns:pic="http://schemas.openxmlformats.org/drawingml/2006/picture">
-            <wp:extent cx="5669280" cy="1699715"/>
-            <wp:docPr id="1521496008" name="Picture 1521496008"/>
-            <wp:cNvGraphicFramePr>
-              <a:graphicFrameLocks noChangeAspect="1"/>
-            </wp:cNvGraphicFramePr>
-            <a:graphic>
-              <a:graphicData uri="http://schemas.openxmlformats.org/drawingml/2006/picture">
-                <pic:pic>
-                  <pic:nvPicPr>
-                    <pic:cNvPr id="0" name="branchimport.png"/>
-                    <pic:cNvPicPr/>
-                  </pic:nvPicPr>
-                  <pic:blipFill>
-                    <a:blip r:embed="rId50"/>
-                    <a:stretch>
-                      <a:fillRect/>
-                    </a:stretch>
-                  </pic:blipFill>
-                  <pic:spPr>
-                    <a:xfrm>
-                      <a:off x="0" y="0"/>
-                      <a:ext cx="5669280" cy="1699715"/>
-                    </a:xfrm>
-                    <a:prstGeom prst="rect"/>
-                  </pic:spPr>
-                </pic:pic>
-              </a:graphicData>
-            </a:graphic>
-          </wp:inline>
-        </w:drawing>
-      </w:r>
-    </w:p>
-    <w:p>
-      <w:pPr>
-        <w:jc w:val="center"/>
-      </w:pPr>
-      <w:r>
-        <w:rPr>
-          <w:i/>
-          <w:color w:val="595959"/>
-          <w:sz w:val="16"/>
-        </w:rPr>
-        <w:t>Step 2: Import Demand\Freight road with Add Missing Lifecycle Profiles and Import structure only (no data).</w:t>
-      </w:r>
-    </w:p>
-    <w:p>
-      <w:pPr>
-        <w:ind w:left="360" w:hanging="360"/>
-      </w:pPr>
-      <w:r>
-        <w:t>4. Repeat the import for Demand\Passenger road, using the same Add Missing Lifecycle Profiles and structure-only settings.</w:t>
-      </w:r>
-    </w:p>
-    <w:p>
-      <w:r>
-        <w:t>The imported lifecycle profiles are ready to select later. Update their values for the economy where needed; do not create a separate profile again for every variable.</w:t>
-      </w:r>
-    </w:p>
-    <w:p>
-      <w:pPr>
         <w:pStyle w:val="Heading1"/>
       </w:pPr>
       <w:r>
@@ -9831,7 +9831,7 @@
               <w:rPr>
                 <w:sz w:val="18"/>
               </w:rPr>
-              <w:t>Section 5.3</w:t>
+              <w:t>Section 5.4</w:t>
             </w:r>
           </w:p>
         </w:tc>

</xml_diff>

<commit_message>
codex: document LEAP vintage year setting
Added Section 6.3 explaining that Number of Vintage Years must match the inclusive lifecycle-profile length, with the Year 0 through Year 37 equals 38 example. Updated the contents list.
</commit_message>
<xml_diff>
--- a/docs/docx/Transport guide for LEAP.docx
+++ b/docs/docx/Transport guide for LEAP.docx
@@ -187,6 +187,14 @@
       </w:pPr>
       <w:r>
         <w:t>6. Setting lifecycle profiles in LEAP</w:t>
+      </w:r>
+    </w:p>
+    <w:p>
+      <w:pPr>
+        <w:pStyle w:val="ListBullet"/>
+      </w:pPr>
+      <w:r>
+        <w:t>6.3 Set Number of Vintage Years</w:t>
       </w:r>
     </w:p>
     <w:p>
@@ -3148,6 +3156,20 @@
           <w:sz w:val="16"/>
         </w:rPr>
         <w:t>In Fuel Economy, set Degradation Profile to Constant for every displayed fuel row. Check all fuels, including rows near the bottom of the list.</w:t>
+      </w:r>
+    </w:p>
+    <w:p>
+      <w:pPr>
+        <w:pStyle w:val="Heading2"/>
+      </w:pPr>
+      <w:r>
+        <w:t>6.3 Set Number of Vintage Years</w:t>
+      </w:r>
+    </w:p>
+    <w:p>
+      <w:pPr/>
+      <w:r>
+        <w:t>In LEAP, open Settings &gt; Years and set Number of Vintage Years to the number of age/year entries in the lifecycle profiles used by the road model. Count the years inclusively: if Freight_vehicle_survival runs from Year 0 through Year 37, it contains 38 years, so set Number of Vintage Years to 38. The relevant survival and vintage profiles should use the same length as this setting. If the setting and profile lengths do not match, stock-turnover, retirements, or vintage calculations may not reproduce the road-model results.</w:t>
       </w:r>
     </w:p>
     <w:p>

</xml_diff>